<commit_message>
court(miss): brief-on-the-merits latex gated (the model's unsplit notes keep note 9 with its mark) and footnote clearance 7.5 for Word's footnote area; docx reported for one authorities page (fb-595.54.51)
Co-Authored-By: Claude Opus 5.5 <noreply@anthropic.com>
</commit_message>
<xml_diff>
--- a/courts/fifth-circuit/mississippi/state/supreme-court/brief-on-the-merits/usage/OUTPUT-brief-on-the-merits.docx
+++ b/courts/fifth-circuit/mississippi/state/supreme-court/brief-on-the-merits/usage/OUTPUT-brief-on-the-merits.docx
@@ -8954,13 +8954,7 @@
         <w:t xml:space="preserve"> </w:t>
       </w:r>
       <w:r>
-        <w:t xml:space="preserve">https://​nymag.​com/​intelligencer/​2014/​07/​this-​is-​what</w:t>
-      </w:r>
-      <w:r>
-        <w:noBreakHyphen/>
-      </w:r>
-      <w:r>
-        <w:t xml:space="preserve">2-​ounces-​of-​weed-​looks-​like.​html. This converts to about 150 joints (marijuana cigarettes) or 250 bowls (marijuana pipes).</w:t>
+        <w:t xml:space="preserve">https://​nymag.​com/​intelligencer/​2014/​07/​this-​is-​what-⁠2-​ounces-​of-​weed-​looks-​like.​html. This converts to about 150 joints (marijuana cigarettes) or 250 bowls (marijuana pipes).</w:t>
       </w:r>
       <w:r>
         <w:t xml:space="preserve"> </w:t>
@@ -8999,13 +8993,7 @@
         <w:t xml:space="preserve"> </w:t>
       </w:r>
       <w:r>
-        <w:t xml:space="preserve">https://​www.​leafly.​com/​news/​cannabis</w:t>
-      </w:r>
-      <w:r>
-        <w:noBreakHyphen/>
-      </w:r>
-      <w:r>
-        <w:t xml:space="preserve">101/​visual-​guide-​to-​cannabis-​quantities. (“So, a full ounce of cannabis, which is 28 grams, can roll nearly 60 joints or pack upwards of 100 bowls.”).</w:t>
+        <w:t xml:space="preserve">https://​www.​leafly.​com/​news/​cannabis-⁠101/​visual-​guide-​to-​cannabis-​quantities. (“So, a full ounce of cannabis, which is 28 grams, can roll nearly 60 joints or pack upwards of 100 bowls.”).</w:t>
       </w:r>
     </w:p>
     <w:p>
@@ -9273,13 +9261,7 @@
         <w:t xml:space="preserve"> </w:t>
       </w:r>
       <w:r>
-        <w:t xml:space="preserve">http://​www.​madisonthecity.​com/​sites/​default/​files/​ZoningOrdinance2012</w:t>
-      </w:r>
-      <w:r>
-        <w:noBreakHyphen/>
-      </w:r>
-      <w:r>
-        <w:t xml:space="preserve">1.​pdf. Initiative Measure No. 65 therefore would likely allow any licensed “medical marijuana treatment center” to grow marijuana within residential areas, substantially harming the City’s legitimate interest in conserving the value of property and protecting the health and safety of its citizenry. district which exceed one-fifth (1/5) of the total number of required signatures, the excess number of signatures from that congressional district shall not be considered by the Secretary of State in determining whether the petition qualifies for placement on the ballot.” MISS.</w:t>
+        <w:t xml:space="preserve">http://​www.​madisonthecity.​com/​sites/​default/​files/​ZoningOrdinance2012-⁠1.​pdf. Initiative Measure No. 65 therefore would likely allow any licensed “medical marijuana treatment center” to grow marijuana within residential areas, substantially harming the City’s legitimate interest in conserving the value of property and protecting the health and safety of its citizenry. district which exceed one-fifth (1/5) of the total number of required signatures, the excess number of signatures from that congressional district shall not be considered by the Secretary of State in determining whether the petition qualifies for placement on the ballot.” MISS.</w:t>
       </w:r>
       <w:r>
         <w:t xml:space="preserve"> </w:t>
@@ -12709,13 +12691,7 @@
         <w:t xml:space="preserve"> </w:t>
       </w:r>
       <w:r>
-        <w:t xml:space="preserve">https://​billofrightsinstitute.​org/​founding-​documents/​primary-​source-​documents/​the-​federalist-​papers/​federalist-​papers-​no</w:t>
-      </w:r>
-      <w:r>
-        <w:noBreakHyphen/>
-      </w:r>
-      <w:r>
-        <w:t xml:space="preserve">51/​;</w:t>
+        <w:t xml:space="preserve">https://​billofrightsinstitute.​org/​founding-​documents/​primary-​source-​documents/​the-​federalist-​papers/​federalist-​papers-​no-⁠51/​;</w:t>
       </w:r>
       <w:r>
         <w:t xml:space="preserve"> </w:t>

</xml_diff>